<commit_message>
docs: record third companion sync failure analysis
</commit_message>
<xml_diff>
--- a/docs/maintenance/AI开发项目_Bug记录模板.docx
+++ b/docs/maintenance/AI开发项目_Bug记录模板.docx
@@ -2680,6 +2680,239 @@
     <w:p>
       <w:r>
         <w:t>v802补充（2026-08-05）：角色端读取桥已统一为外置真实iPhone来源。角色查看定位、总屏幕时长和逐App时长时不再读取小手机内置数据；默认“内外同时”在外置未连接或稳定ID未绑定时整条拒绝，不再静默退化为仅内置。伴生端新增DeviceActivity报告可用标记，报告尚未生成时页面显示“待同步”，不得把0分钟当作真实结果。伴生设备操作记录仅保留三天。</w:t>
+      </w:r>
+    </w:p>
+    <w:p/>
+    <w:p>
+      <w:pPr>
+        <w:pStyle w:val="Heading1"/>
+      </w:pPr>
+      <w:r>
+        <w:t>v802 第三次现场失败复盘（2026-08-05，尚未修复）</w:t>
+      </w:r>
+    </w:p>
+    <w:p>
+      <w:pPr>
+        <w:pStyle w:val="ListBullet"/>
+      </w:pPr>
+      <w:r>
+        <w:rPr>
+          <w:b/>
+        </w:rPr>
+        <w:t>现场证据：</w:t>
+      </w:r>
+      <w:r>
+        <w:t>iPhone 已授权且 DeviceActivityReport 能显示今日总时长 11h18m31s，但主 App 明确显示“尚未读取到真实逐 App 数据”；这证明权限和系统总时长读取正常，失败点位于报告扩展写入 App Group、主 App 读取 App Group 或实际安装版本不一致。</w:t>
+      </w:r>
+    </w:p>
+    <w:p>
+      <w:pPr>
+        <w:pStyle w:val="ListBullet"/>
+      </w:pPr>
+      <w:r>
+        <w:rPr>
+          <w:b/>
+        </w:rPr>
+        <w:t>现场证据：</w:t>
+      </w:r>
+      <w:r>
+        <w:t>小手机能显示外置最近同步时间、一个外置足迹点，角色也能读取真实位置；因此配对、owner/device secret、位置快照和服务器基本传输链路已经工作，不能再把问题归因于整体未连接。</w:t>
+      </w:r>
+    </w:p>
+    <w:p>
+      <w:pPr>
+        <w:pStyle w:val="ListBullet"/>
+      </w:pPr>
+      <w:r>
+        <w:rPr>
+          <w:b/>
+        </w:rPr>
+        <w:t>现场证据：</w:t>
+      </w:r>
+      <w:r>
+        <w:t>点击锁定后页面提示“已提交锁定；尚未绑定内置 App，本次仅控制真实 iPhone”，同时外置状态仍为“待 iPhone 端接入”、外置已锁定仍为 0；这表示命令只进入服务器队列，iPhone 没有执行并回执。</w:t>
+      </w:r>
+    </w:p>
+    <w:p>
+      <w:pPr>
+        <w:pStyle w:val="ListBullet"/>
+      </w:pPr>
+      <w:r>
+        <w:rPr>
+          <w:b/>
+        </w:rPr>
+        <w:t>共同根因 1：</w:t>
+      </w:r>
+      <w:r>
+        <w:t>PhoneCompanionReport.swift 曾被错误替换成 PhoneCompanionTestApp 的主程序入口，出现 Cannot find CompanionRootView in scope。该次构建没有包含可用的报告扩展，所以当时安装/观察到的仍是旧版本行为。以后禁止用相似文件名猜目标，必须逐个核对 Target 与 @main 类型。</w:t>
+      </w:r>
+    </w:p>
+    <w:p>
+      <w:pPr>
+        <w:pStyle w:val="ListBullet"/>
+      </w:pPr>
+      <w:r>
+        <w:rPr>
+          <w:b/>
+        </w:rPr>
+        <w:t>共同根因 2：</w:t>
+      </w:r>
+      <w:r>
+        <w:t>CompanionSyncService.synchronize(requireFreshReport: true) 在上传快照和拉取命令之前，先等待新的报告快照；一旦报告扩展未写入 App Group，它就直接抛错退出。因此一个逐 App 报告失败会连带阻断足迹上传、锁定命令拉取和执行回执，四个现象并非四条独立故障。</w:t>
+      </w:r>
+    </w:p>
+    <w:p>
+      <w:pPr>
+        <w:pStyle w:val="ListBullet"/>
+      </w:pPr>
+      <w:r>
+        <w:rPr>
+          <w:b/>
+        </w:rPr>
+        <w:t>共同根因 3：</w:t>
+      </w:r>
+      <w:r>
+        <w:t>外置命令依赖 CompanionSyncView 的 .task 定时轮询；当前没有 APNs/后台任务能够可靠唤醒 iPhone。网页“立即同步”只是新增队列命令，不能直接唤醒未停留在真实同步页面或已进入后台的伴生 App。</w:t>
+      </w:r>
+    </w:p>
+    <w:p>
+      <w:pPr>
+        <w:pStyle w:val="ListBullet"/>
+      </w:pPr>
+      <w:r>
+        <w:rPr>
+          <w:b/>
+        </w:rPr>
+        <w:t>足迹根因：</w:t>
+      </w:r>
+      <w:r>
+        <w:t>足迹当前以 iPhone UserDefaults 为来源单向上传服务器。后台删除服务器记录不会生成清除指令，iPhone 本地旧点会在下一次快照中重新上传。现场只显示一个点也说明静止合并阈值已生效；未实现的是双向删除/清除同步，而不是定位完全未上传。</w:t>
+      </w:r>
+    </w:p>
+    <w:p>
+      <w:pPr>
+        <w:pStyle w:val="ListBullet"/>
+      </w:pPr>
+      <w:r>
+        <w:rPr>
+          <w:b/>
+        </w:rPr>
+        <w:t>内外同时根因：</w:t>
+      </w:r>
+      <w:r>
+        <w:t>网页 companionOwnerAction 在外置 App 尚未绑定内置稳定 ID 时，仍绕过默认 both，调用 external-only 命令并提示“本次仅控制真实 iPhone”。这违反“内外同时不得静默降级”的产品规则，也会让用户误以为双端控制已经生成。</w:t>
+      </w:r>
+    </w:p>
+    <w:p>
+      <w:pPr>
+        <w:pStyle w:val="ListBullet"/>
+      </w:pPr>
+      <w:r>
+        <w:rPr>
+          <w:b/>
+        </w:rPr>
+        <w:t>逐 App 数据根因边界：</w:t>
+      </w:r>
+      <w:r>
+        <w:t>总时长可见不等于 App Group 快照成功。仍需在真机逐项确认：TotalActivityReport.swift 是否属于 PhoneCompanionReport Target；主 App 与报告扩展是否同时具有 group.com.qianyi.PhoneCompanionTest entitlement；运行中的安装包是否确实包含新报告代码。在拿到这些证据前，不得继续猜测为授权问题。</w:t>
+      </w:r>
+    </w:p>
+    <w:p>
+      <w:pPr>
+        <w:pStyle w:val="ListBullet"/>
+      </w:pPr>
+      <w:r>
+        <w:rPr>
+          <w:b/>
+        </w:rPr>
+        <w:t>失败方案 1：</w:t>
+      </w:r>
+      <w:r>
+        <w:t>把 DeviceActivityReport 页面能显示总时长当作逐 App 快照已经写入的证明。页面渲染与 App Group 跨进程落盘是两件事，后续必须分别验证。</w:t>
+      </w:r>
+    </w:p>
+    <w:p>
+      <w:pPr>
+        <w:pStyle w:val="ListBullet"/>
+      </w:pPr>
+      <w:r>
+        <w:rPr>
+          <w:b/>
+        </w:rPr>
+        <w:t>失败方案 2：</w:t>
+      </w:r>
+      <w:r>
+        <w:t>只改角色提示、网页显示和“外置优先”来源，未先证明 iPhone 已上传 screenTime.apps[]、命令已 acknowledged。网页自动测试只能验证映射逻辑，不能替代 Xcode 真机扩展、entitlement 和系统锁定验证。</w:t>
+      </w:r>
+    </w:p>
+    <w:p>
+      <w:pPr>
+        <w:pStyle w:val="ListBullet"/>
+      </w:pPr>
+      <w:r>
+        <w:rPr>
+          <w:b/>
+        </w:rPr>
+        <w:t>失败方案 3：</w:t>
+      </w:r>
+      <w:r>
+        <w:t>继续把屏幕报告设为整个同步函数的硬前置条件，并假定手动按钮或网页队列能够唤醒 iPhone。该结构会把一个报告故障扩大成足迹、命令和锁定同时失效，禁止原样重复。</w:t>
+      </w:r>
+    </w:p>
+    <w:p>
+      <w:pPr>
+        <w:pStyle w:val="ListBullet"/>
+      </w:pPr>
+      <w:r>
+        <w:rPr>
+          <w:b/>
+        </w:rPr>
+        <w:t>失败方案 4：</w:t>
+      </w:r>
+      <w:r>
+        <w:t>通过多次整段粘贴在相似文件名之间替换代码，且未在每次替换后先确认当前 Target、文件入口和零编译错误。这直接造成报告 Target 被主 App 入口覆盖。以后一次只替换一个明确文件，并先截取 Target/错误状态确认。</w:t>
+      </w:r>
+    </w:p>
+    <w:p>
+      <w:pPr>
+        <w:pStyle w:val="ListBullet"/>
+      </w:pPr>
+      <w:r>
+        <w:rPr>
+          <w:b/>
+        </w:rPr>
+        <w:t>影响文件/模块：</w:t>
+      </w:r>
+      <w:r>
+        <w:t>原生端：PhoneCompanionReport.swift、TotalActivityReport.swift、CompanionSyncView.swift、LocationManager.swift、三个 Target 的 Signing &amp; Capabilities。网页端：app.js 的命令派发、默认 both 拒绝降级、回执显示。服务器端：phone_companion_commands 队列与未来的足迹清除指令。</w:t>
+      </w:r>
+    </w:p>
+    <w:p>
+      <w:pPr>
+        <w:pStyle w:val="ListBullet"/>
+      </w:pPr>
+      <w:r>
+        <w:rPr>
+          <w:b/>
+        </w:rPr>
+        <w:t>已有功能影响评估：</w:t>
+      </w:r>
+      <w:r>
+        <w:t>当前不改代码。后续若仅恢复报告入口和 entitlement，授权、多个 App 选择、手动锁定、每日限额、定位地图等既有功能理论上不受影响；若增加后台命令或双向足迹删除，则属于新同步机制，必须单独设计、真机验证，不能与最小修复混在一次操作中。</w:t>
+      </w:r>
+    </w:p>
+    <w:p>
+      <w:pPr>
+        <w:pStyle w:val="ListBullet"/>
+      </w:pPr>
+      <w:r>
+        <w:rPr>
+          <w:b/>
+        </w:rPr>
+        <w:t>当前结论：</w:t>
+      </w:r>
+      <w:r>
+        <w:t>本轮只完成原因分析和记录，状态仍为未修复。下一次修改必须先验证报告 Target/App Group/实际安装版本，再把报告生成、基础快照上传和命令处理解耦；不得再次重复此前三次的整包替换和网页通过即视为真机成功。</w:t>
       </w:r>
     </w:p>
     <w:sectPr>

</xml_diff>

<commit_message>
fix: verify companion lock targets and device acknowledgements
</commit_message>
<xml_diff>
--- a/docs/maintenance/AI开发项目_Bug记录模板.docx
+++ b/docs/maintenance/AI开发项目_Bug记录模板.docx
@@ -3973,6 +3973,105 @@
       </w:pPr>
       <w:r>
         <w:t>回归结果：已覆盖四个 AI 精确锁定、已绑定双端、未绑定外置、局部刷新、统一限额、缓存版本与全量功能测试，共 313 项全部通过。</w:t>
+      </w:r>
+    </w:p>
+    <w:p>
+      <w:pPr>
+        <w:pStyle w:val="Heading2"/>
+      </w:pPr>
+      <w:r>
+        <w:t>Bug 45：外置 App 显示已锁但真实 iPhone 未锁（v820，2026-08-06）</w:t>
+      </w:r>
+    </w:p>
+    <w:p>
+      <w:pPr>
+        <w:pStyle w:val="Heading3"/>
+      </w:pPr>
+      <w:r>
+        <w:t>问题现象</w:t>
+      </w:r>
+    </w:p>
+    <w:p>
+      <w:r>
+        <w:t>伴生设备页把携程旅行等外置 App 卡片持续显示为红色“已锁定”，刷新和点击解锁后仍可能保持红色；但真实 iPhone 后台并没有出现系统屏蔽。角色口头锁定与页面手动锁定都可能只留下“已提交”的记录，没有真实设备执行结果。</w:t>
+      </w:r>
+    </w:p>
+    <w:p>
+      <w:pPr>
+        <w:pStyle w:val="Heading3"/>
+      </w:pPr>
+      <w:r>
+        <w:t>v807 成功条件</w:t>
+      </w:r>
+    </w:p>
+    <w:p>
+      <w:r>
+        <w:t>v807 使用外置 App 的稳定 ID 下发命令；当 iPhone Companion App 正在运行并成功拉取命令、写入 ManagedSettingsStore、回执命令且上传命令后的新快照时，真实锁定可以生效。v807 当时未完整区分“服务器已入队、设备已回执、回执后快照已确认”三种状态，因此成功场景可用，但失败场景可能被旧快照掩盖。</w:t>
+      </w:r>
+    </w:p>
+    <w:p>
+      <w:pPr>
+        <w:pStyle w:val="Heading3"/>
+      </w:pPr>
+      <w:r>
+        <w:t>根本原因</w:t>
+      </w:r>
+    </w:p>
+    <w:p>
+      <w:r>
+        <w:t>第一，v819 的限额关联允许外置 App 关联到不同名称的内置虚拟 App，锁定流程可能把真实目标错误替换成放映室等内置目标。第二，网页把服务器接受命令或旧快照中的 locked=true 当成当前真实成功，没有要求非空命令 ID、设备回执和回执后的新快照同时成立。第三，iOS 当前仍靠 Companion App 轮询命令；网页本身不能在 App 未运行时唤醒 iPhone，未回执命令不等于锁定成功。</w:t>
+      </w:r>
+    </w:p>
+    <w:p>
+      <w:pPr>
+        <w:pStyle w:val="Heading3"/>
+      </w:pPr>
+      <w:r>
+        <w:t>v820 修复</w:t>
+      </w:r>
+    </w:p>
+    <w:p>
+      <w:r>
+        <w:t>真实 iPhone 锁定/解锁始终按用户点名的外置 App 稳定 ID 精确下发；不同名称的内置关联只用于统一限额，不再参与锁定替换。服务器若返回空命令 ID 立即记为失败。命令提交后自动轮询回执；页面把等待入队、等待设备回执、等待回执后快照、回执与快照冲突分别显示，只有设备回执且更新后的快照与动作一致时才确认状态。角色也不得在此之前断言“已经锁上”。</w:t>
+      </w:r>
+    </w:p>
+    <w:p>
+      <w:pPr>
+        <w:pStyle w:val="Heading3"/>
+      </w:pPr>
+      <w:r>
+        <w:t>风险与边界</w:t>
+      </w:r>
+    </w:p>
+    <w:p>
+      <w:r>
+        <w:t>本修复消除伪成功和目标错锁，不会要求重新授权、重选 App 或重新添加 App Groups。若 Companion App 没有执行轮询，命令会如实停留在等待设备回执；要实现 App 完全不运行时的即时远程锁定，后续仍需独立的 APNs 后台唤醒方案及相应分发能力，不能由网页状态替代。</w:t>
+      </w:r>
+    </w:p>
+    <w:p>
+      <w:pPr>
+        <w:pStyle w:val="Heading3"/>
+      </w:pPr>
+      <w:r>
+        <w:t>验证结果</w:t>
+      </w:r>
+    </w:p>
+    <w:p>
+      <w:r>
+        <w:t>新增精确外置目标、不同名关联不得替换、空命令拒绝、等待回执、等待新快照、回执冲突及红色确认状态测试；JavaScript 语法检查通过，完整 Node 回归 315/315 通过。</w:t>
+      </w:r>
+    </w:p>
+    <w:p>
+      <w:pPr>
+        <w:pStyle w:val="Heading3"/>
+      </w:pPr>
+      <w:r>
+        <w:t>失败方案记录</w:t>
+      </w:r>
+    </w:p>
+    <w:p>
+      <w:r>
+        <w:t>禁止再次用“按钮变红、服务器已入队、旧快照 locked=true、角色说已经锁上”中的任何一项单独代表真实成功；也禁止因限额关联而拿不同名内置虚拟 App 代替外置目标。</w:t>
       </w:r>
     </w:p>
     <w:sectPr>

</xml_diff>